<commit_message>
Afegeix imatges al temari T06 (Seguretat lògica), en .md i .docx
Incorpora 6 imatges ja utilitzades a la presentació del mateix subtema
(esquema d'autenticació, cas real de Hawaii, lector de retina, diagrama
rwx, visor d'esdeveniments de Windows i un encaminador) als punts del
temari on completen millor l'explicació escrita. Prova pilot per validar
el disseny abans d'aplicar-lo a la resta de subtemes del currículum.

Co-Authored-By: Claude Sonnet 5 <noreply@anthropic.com>
Claude-Session: https://claude.ai/code/session_01N3G5yf1RZohTyRwwRiXySq
</commit_message>
<xml_diff>
--- a/RA1 - Seguretat passiva/AA3 - Seguretat logica/T06_Temari_Seguretat_Logica.docx
+++ b/RA1 - Seguretat passiva/AA3 - Seguretat logica/T06_Temari_Seguretat_Logica.docx
@@ -159,6 +159,58 @@
           <w:szCs w:val="21"/>
         </w:rPr>
         <w:t xml:space="preserve">Primer cal AUTENTICAR-SE per entrar; després, el sistema AUTORITZA (o no) cada acció que es vulgui fer.</w:t>
+      </w:r>
+    </w:p>
+    <w:p>
+      <w:pPr>
+        <w:jc w:val="center"/>
+      </w:pPr>
+      <w:r>
+        <w:drawing>
+          <wp:inline xmlns:a="http://schemas.openxmlformats.org/drawingml/2006/main" xmlns:pic="http://schemas.openxmlformats.org/drawingml/2006/picture">
+            <wp:extent cx="5486400" cy="2778022"/>
+            <wp:docPr id="1" name="Picture 1"/>
+            <wp:cNvGraphicFramePr>
+              <a:graphicFrameLocks noChangeAspect="1"/>
+            </wp:cNvGraphicFramePr>
+            <a:graphic>
+              <a:graphicData uri="http://schemas.openxmlformats.org/drawingml/2006/picture">
+                <pic:pic>
+                  <pic:nvPicPr>
+                    <pic:cNvPr id="0" name="fig31_esquema_autenticacio.png"/>
+                    <pic:cNvPicPr/>
+                  </pic:nvPicPr>
+                  <pic:blipFill>
+                    <a:blip r:embed="rId8"/>
+                    <a:stretch>
+                      <a:fillRect/>
+                    </a:stretch>
+                  </pic:blipFill>
+                  <pic:spPr>
+                    <a:xfrm>
+                      <a:off x="0" y="0"/>
+                      <a:ext cx="5486400" cy="2778022"/>
+                    </a:xfrm>
+                    <a:prstGeom prst="rect"/>
+                  </pic:spPr>
+                </pic:pic>
+              </a:graphicData>
+            </a:graphic>
+          </wp:inline>
+        </w:drawing>
+      </w:r>
+    </w:p>
+    <w:p>
+      <w:pPr>
+        <w:jc w:val="center"/>
+      </w:pPr>
+      <w:r>
+        <w:rPr>
+          <w:i/>
+          <w:color w:val="5B6B77"/>
+          <w:sz w:val="19"/>
+        </w:rPr>
+        <w:t>Esquema del sistema d'autenticació per a l'entrada al sistema.</w:t>
       </w:r>
     </w:p>
     <w:p>
@@ -1098,6 +1150,58 @@
     </w:p>
     <w:p>
       <w:pPr>
+        <w:jc w:val="center"/>
+      </w:pPr>
+      <w:r>
+        <w:drawing>
+          <wp:inline xmlns:a="http://schemas.openxmlformats.org/drawingml/2006/main" xmlns:pic="http://schemas.openxmlformats.org/drawingml/2006/picture">
+            <wp:extent cx="5486400" cy="2433892"/>
+            <wp:docPr id="2" name="Picture 2"/>
+            <wp:cNvGraphicFramePr>
+              <a:graphicFrameLocks noChangeAspect="1"/>
+            </wp:cNvGraphicFramePr>
+            <a:graphic>
+              <a:graphicData uri="http://schemas.openxmlformats.org/drawingml/2006/picture">
+                <pic:pic>
+                  <pic:nvPicPr>
+                    <pic:cNvPr id="0" name="hawaii_postit_password.png"/>
+                    <pic:cNvPicPr/>
+                  </pic:nvPicPr>
+                  <pic:blipFill>
+                    <a:blip r:embed="rId9"/>
+                    <a:stretch>
+                      <a:fillRect/>
+                    </a:stretch>
+                  </pic:blipFill>
+                  <pic:spPr>
+                    <a:xfrm>
+                      <a:off x="0" y="0"/>
+                      <a:ext cx="5486400" cy="2433892"/>
+                    </a:xfrm>
+                    <a:prstGeom prst="rect"/>
+                  </pic:spPr>
+                </pic:pic>
+              </a:graphicData>
+            </a:graphic>
+          </wp:inline>
+        </w:drawing>
+      </w:r>
+    </w:p>
+    <w:p>
+      <w:pPr>
+        <w:jc w:val="center"/>
+      </w:pPr>
+      <w:r>
+        <w:rPr>
+          <w:i/>
+          <w:color w:val="5B6B77"/>
+          <w:sz w:val="19"/>
+        </w:rPr>
+        <w:t>Cas real (2018): un operador del centre d'emergències de Hawaii tenia la contrasenya del sistema apuntada en un post-it, ben visible al seu lloc de treball.</w:t>
+      </w:r>
+    </w:p>
+    <w:p>
+      <w:pPr>
         <w:pStyle w:val="Heading1"/>
         <w:spacing w:after="180" w:before="400"/>
       </w:pPr>
@@ -1137,6 +1241,58 @@
           <w:szCs w:val="22"/>
         </w:rPr>
         <w:t xml:space="preserve">Basats en el comportament ("alguna cosa que l'usuari FA"): signatura, forma d'escriure... poden canviar amb el temps.</w:t>
+      </w:r>
+    </w:p>
+    <w:p>
+      <w:pPr>
+        <w:jc w:val="center"/>
+      </w:pPr>
+      <w:r>
+        <w:drawing>
+          <wp:inline xmlns:a="http://schemas.openxmlformats.org/drawingml/2006/main" xmlns:pic="http://schemas.openxmlformats.org/drawingml/2006/picture">
+            <wp:extent cx="2926080" cy="2715018"/>
+            <wp:docPr id="3" name="Picture 3"/>
+            <wp:cNvGraphicFramePr>
+              <a:graphicFrameLocks noChangeAspect="1"/>
+            </wp:cNvGraphicFramePr>
+            <a:graphic>
+              <a:graphicData uri="http://schemas.openxmlformats.org/drawingml/2006/picture">
+                <pic:pic>
+                  <pic:nvPicPr>
+                    <pic:cNvPr id="0" name="foto_biometric_retina.png"/>
+                    <pic:cNvPicPr/>
+                  </pic:nvPicPr>
+                  <pic:blipFill>
+                    <a:blip r:embed="rId10"/>
+                    <a:stretch>
+                      <a:fillRect/>
+                    </a:stretch>
+                  </pic:blipFill>
+                  <pic:spPr>
+                    <a:xfrm>
+                      <a:off x="0" y="0"/>
+                      <a:ext cx="2926080" cy="2715018"/>
+                    </a:xfrm>
+                    <a:prstGeom prst="rect"/>
+                  </pic:spPr>
+                </pic:pic>
+              </a:graphicData>
+            </a:graphic>
+          </wp:inline>
+        </w:drawing>
+      </w:r>
+    </w:p>
+    <w:p>
+      <w:pPr>
+        <w:jc w:val="center"/>
+      </w:pPr>
+      <w:r>
+        <w:rPr>
+          <w:i/>
+          <w:color w:val="5B6B77"/>
+          <w:sz w:val="19"/>
+        </w:rPr>
+        <w:t>Els sistemes biomètrics basats en la lectura de la retina són una eina molt fiable com a mesura d'autenticació.</w:t>
       </w:r>
     </w:p>
     <w:p>
@@ -1465,6 +1621,45 @@
           <w:szCs w:val="21"/>
         </w:rPr>
         <w:t xml:space="preserve">r = lectura (read) · w = escriptura (write) · x = execució (execution). Sense permís d'execució en un directori, ningú no hi pot entrar, encara que en tingui de lectura.</w:t>
+      </w:r>
+    </w:p>
+    <w:p>
+      <w:pPr>
+        <w:jc w:val="center"/>
+      </w:pPr>
+      <w:r>
+        <w:drawing>
+          <wp:inline xmlns:a="http://schemas.openxmlformats.org/drawingml/2006/main" xmlns:pic="http://schemas.openxmlformats.org/drawingml/2006/picture">
+            <wp:extent cx="2743200" cy="1248310"/>
+            <wp:docPr id="4" name="Picture 4"/>
+            <wp:cNvGraphicFramePr>
+              <a:graphicFrameLocks noChangeAspect="1"/>
+            </wp:cNvGraphicFramePr>
+            <a:graphic>
+              <a:graphicData uri="http://schemas.openxmlformats.org/drawingml/2006/picture">
+                <pic:pic>
+                  <pic:nvPicPr>
+                    <pic:cNvPr id="0" name="diagrama_rwx.png"/>
+                    <pic:cNvPicPr/>
+                  </pic:nvPicPr>
+                  <pic:blipFill>
+                    <a:blip r:embed="rId11"/>
+                    <a:stretch>
+                      <a:fillRect/>
+                    </a:stretch>
+                  </pic:blipFill>
+                  <pic:spPr>
+                    <a:xfrm>
+                      <a:off x="0" y="0"/>
+                      <a:ext cx="2743200" cy="1248310"/>
+                    </a:xfrm>
+                    <a:prstGeom prst="rect"/>
+                  </pic:spPr>
+                </pic:pic>
+              </a:graphicData>
+            </a:graphic>
+          </wp:inline>
+        </w:drawing>
       </w:r>
     </w:p>
     <w:p>
@@ -1842,6 +2037,97 @@
           <w:szCs w:val="21"/>
         </w:rPr>
         <w:t xml:space="preserve">Un decrement molt accentuat del rendiment pot ser un indicador que hi ha un virus o un cavall de Troia treballant en segon pla.</w:t>
+      </w:r>
+    </w:p>
+    <w:p>
+      <w:pPr>
+        <w:jc w:val="center"/>
+      </w:pPr>
+      <w:r>
+        <w:drawing>
+          <wp:inline xmlns:a="http://schemas.openxmlformats.org/drawingml/2006/main" xmlns:pic="http://schemas.openxmlformats.org/drawingml/2006/picture">
+            <wp:extent cx="5199819" cy="3657600"/>
+            <wp:docPr id="5" name="Picture 5"/>
+            <wp:cNvGraphicFramePr>
+              <a:graphicFrameLocks noChangeAspect="1"/>
+            </wp:cNvGraphicFramePr>
+            <a:graphic>
+              <a:graphicData uri="http://schemas.openxmlformats.org/drawingml/2006/picture">
+                <pic:pic>
+                  <pic:nvPicPr>
+                    <pic:cNvPr id="0" name="fig32_visor_esdeveniments_windows.png"/>
+                    <pic:cNvPicPr/>
+                  </pic:nvPicPr>
+                  <pic:blipFill>
+                    <a:blip r:embed="rId12"/>
+                    <a:stretch>
+                      <a:fillRect/>
+                    </a:stretch>
+                  </pic:blipFill>
+                  <pic:spPr>
+                    <a:xfrm>
+                      <a:off x="0" y="0"/>
+                      <a:ext cx="5199819" cy="3657600"/>
+                    </a:xfrm>
+                    <a:prstGeom prst="rect"/>
+                  </pic:spPr>
+                </pic:pic>
+              </a:graphicData>
+            </a:graphic>
+          </wp:inline>
+        </w:drawing>
+      </w:r>
+    </w:p>
+    <w:p>
+      <w:pPr>
+        <w:jc w:val="center"/>
+      </w:pPr>
+      <w:r>
+        <w:rPr>
+          <w:i/>
+          <w:color w:val="5B6B77"/>
+          <w:sz w:val="19"/>
+        </w:rPr>
+        <w:t>Visor d'esdeveniments de Windows. Els encaminadors (routers) també generen registres de seguretat rellevants.</w:t>
+      </w:r>
+    </w:p>
+    <w:p>
+      <w:pPr>
+        <w:jc w:val="center"/>
+      </w:pPr>
+      <w:r>
+        <w:drawing>
+          <wp:inline xmlns:a="http://schemas.openxmlformats.org/drawingml/2006/main" xmlns:pic="http://schemas.openxmlformats.org/drawingml/2006/picture">
+            <wp:extent cx="2011680" cy="1353724"/>
+            <wp:docPr id="6" name="Picture 6"/>
+            <wp:cNvGraphicFramePr>
+              <a:graphicFrameLocks noChangeAspect="1"/>
+            </wp:cNvGraphicFramePr>
+            <a:graphic>
+              <a:graphicData uri="http://schemas.openxmlformats.org/drawingml/2006/picture">
+                <pic:pic>
+                  <pic:nvPicPr>
+                    <pic:cNvPr id="0" name="foto_encaminador.png"/>
+                    <pic:cNvPicPr/>
+                  </pic:nvPicPr>
+                  <pic:blipFill>
+                    <a:blip r:embed="rId13"/>
+                    <a:stretch>
+                      <a:fillRect/>
+                    </a:stretch>
+                  </pic:blipFill>
+                  <pic:spPr>
+                    <a:xfrm>
+                      <a:off x="0" y="0"/>
+                      <a:ext cx="2011680" cy="1353724"/>
+                    </a:xfrm>
+                    <a:prstGeom prst="rect"/>
+                  </pic:spPr>
+                </pic:pic>
+              </a:graphicData>
+            </a:graphic>
+          </wp:inline>
+        </w:drawing>
       </w:r>
     </w:p>
     <w:p>

</xml_diff>